<commit_message>
Finalize abstract with primary results
</commit_message>
<xml_diff>
--- a/output/documents/EARS-Net_Q-Learning_Abstract.docx
+++ b/output/documents/EARS-Net_Q-Learning_Abstract.docx
@@ -26,7 +26,30 @@
           <w:rFonts w:ascii="Times New Roman" w:hAnsi="Times New Roman"/>
           <w:sz w:val="28"/>
         </w:rPr>
-        <w:t>1*Dunsky, Idan, 2Kaveh Shtul, Yaniv</w:t>
+        <w:t>Idan Dunsky</w:t>
+      </w:r>
+      <w:r>
+        <w:rPr>
+          <w:rFonts w:ascii="Times New Roman" w:hAnsi="Times New Roman"/>
+          <w:sz w:val="20"/>
+          <w:vertAlign w:val="superscript"/>
+        </w:rPr>
+        <w:t>1*</w:t>
+      </w:r>
+      <w:r>
+        <w:rPr>
+          <w:rFonts w:ascii="Times New Roman" w:hAnsi="Times New Roman"/>
+          <w:sz w:val="28"/>
+        </w:rPr>
+        <w:t>, Yaniv Kaveh Shtul</w:t>
+      </w:r>
+      <w:r>
+        <w:rPr>
+          <w:rFonts w:ascii="Times New Roman" w:hAnsi="Times New Roman"/>
+          <w:sz w:val="20"/>
+          <w:vertAlign w:val="superscript"/>
+        </w:rPr>
+        <w:t>2</w:t>
       </w:r>
     </w:p>
     <w:p>
@@ -50,9 +73,17 @@
       <w:r>
         <w:rPr>
           <w:rFonts w:ascii="Times New Roman" w:hAnsi="Times New Roman"/>
+          <w:sz w:val="18"/>
+          <w:vertAlign w:val="superscript"/>
+        </w:rPr>
+        <w:t>1</w:t>
+      </w:r>
+      <w:r>
+        <w:rPr>
+          <w:rFonts w:ascii="Times New Roman" w:hAnsi="Times New Roman"/>
           <w:sz w:val="24"/>
         </w:rPr>
-        <w:t>1idan.dunsky@s.afeka.ac.il, Afeka Academic College of Engineering, Israel, ID: 319070595</w:t>
+        <w:t>idan.dunsky@s.afeka.ac.il, Afeka Academic College of Engineering, Israel, ID: 319070595</w:t>
       </w:r>
     </w:p>
     <w:p>
@@ -63,9 +94,17 @@
       <w:r>
         <w:rPr>
           <w:rFonts w:ascii="Times New Roman" w:hAnsi="Times New Roman"/>
+          <w:sz w:val="18"/>
+          <w:vertAlign w:val="superscript"/>
+        </w:rPr>
+        <w:t>2</w:t>
+      </w:r>
+      <w:r>
+        <w:rPr>
+          <w:rFonts w:ascii="Times New Roman" w:hAnsi="Times New Roman"/>
           <w:sz w:val="24"/>
         </w:rPr>
-        <w:t>2yaniv.kaveh.shtul@s.afeka.ac.il, Afeka Academic College of Engineering, Israel, ID: 206768004</w:t>
+        <w:t>yaniv.kaveh.shtul@s.afeka.ac.il, Afeka Academic College of Engineering, Israel, ID: 206768004</w:t>
       </w:r>
     </w:p>
     <w:p>
@@ -78,7 +117,7 @@
           <w:rFonts w:ascii="Times New Roman" w:hAnsi="Times New Roman"/>
           <w:sz w:val="24"/>
         </w:rPr>
-        <w:t>Antimicrobial resistance makes empirical antibiotic selection difficult: susceptibility patterns differ between countries, and a policy that worked in one period may be unreliable a year later. This project asks whether Wasserstein-robust Q-learning can maintain antibiotic coverage when the observed resistance distribution shifts. Classical Q-learning provides the main comparison.</w:t>
+        <w:t>Antimicrobial resistance complicates empirical antibiotic selection because susceptibility patterns vary across countries and time. This study evaluates whether Wasserstein-robust Q-learning maintains better one-year-ahead antibiotic coverage than classical Q-learning when European Escherichia coli resistance distributions shift.</w:t>
       </w:r>
     </w:p>
     <w:p>
@@ -91,7 +130,7 @@
           <w:rFonts w:ascii="Times New Roman" w:hAnsi="Times New Roman"/>
           <w:sz w:val="24"/>
         </w:rPr>
-        <w:t>The analysis uses public EARS-Net surveillance data for invasive Escherichia coli isolates from 2015 to 2024. After completeness filtering, 28 countries are retained. Each country-year is represented by three binary resistance indicators, producing an eight-state Markov decision process. The actions are third-generation cephalosporins, fluoroquinolones, and carbapenems. Reward is defined as next-year susceptibility with a fixed penalty for carbapenem use. Antibiotic choice is not assumed to alter the following year's resistance state; the model is therefore population-informed and not a patient-level prescribing system.</w:t>
+        <w:t>Public EARS-Net surveillance data for invasive E. coli isolates from 2015-2024 were used to construct an eight-state, three-action Markov decision process after completeness filtering retained 28 countries. States encode binary resistance to third-generation cephalosporins, fluoroquinolones, and carbapenems; actions select one of these classes. Transitions are action-independent, and the primary reward is next-year susceptibility minus 0.10 for carbapenem use. Hyperparameters were selected with rolling-origin validation. The Wasserstein radius was calibrated from historical annual distribution shifts, and final policies were trained with 30 fixed seeds and checked against exact Bellman solutions.</w:t>
       </w:r>
     </w:p>
     <w:p>
@@ -104,7 +143,7 @@
           <w:rFonts w:ascii="Times New Roman" w:hAnsi="Times New Roman"/>
           <w:sz w:val="24"/>
         </w:rPr>
-        <w:t>Classical and Wasserstein-robust tabular Q-learning follow the sampled-trajectory and c-transform update of the reference algorithm. The uncertainty radius is calibrated from historical year-to-year changes in country state distributions. Hyperparameters are selected by rolling-origin validation, and exact finite-state Bellman solutions are used to check whether the sampled learners have converged. Policies chosen in 2020-2023 are evaluated against outcomes in 2021-2024 using adjusted coverage, raw susceptibility, carbapenem use, oracle regret, yearly performance, and worst-country reward.</w:t>
+        <w:t>Decisions made in 2020-2023 were evaluated against 110 observed country transitions ending in 2021-2024. The classical exact policy achieved 90.13% adjusted coverage, 96.58% raw susceptibility, and 64.55% carbapenem use. At the calibrated radius, the robust exact policy selected carbapenems in all eight states, achieving 89.76% adjusted coverage and 99.76% raw susceptibility with 100% carbapenem use. Thus, robustness increased raw susceptibility by 3.18 percentage points but reduced the primary endpoint by 0.36 points. No final training group satisfied the strict criterion that every seeded policy match its exact Bellman reference. In a prespecified cost-adjusted secondary scenario, the classical policy reduced carbapenem use to 49.09%.</w:t>
       </w:r>
     </w:p>
     <w:p>
@@ -117,7 +156,7 @@
           <w:rFonts w:ascii="Times New Roman" w:hAnsi="Times New Roman"/>
           <w:sz w:val="24"/>
         </w:rPr>
-        <w:t>Unlike the reference paper's illustrative control problems, this study applies Wasserstein-robust Q-learning to sparse, country-level antimicrobial-resistance surveillance. Robust learning will be considered useful only if it improves one-year-ahead adjusted coverage without achieving that improvement merely through greater carbapenem use. The intended contribution is a reproducible test of that trade-off under an observed temporal shift, together with a clear account of convergence and data limitations.</w:t>
+        <w:t>Wasserstein robustness did not improve adjusted coverage in this surveillance-based formulation and shifted decisions toward uniformly broad treatment. The study contributes a reproducible application of robust Q-learning to antimicrobial-resistance drift and demonstrates why efficacy, stewardship penalties, and convergence diagnostics must be reported together. The findings are population-level, non-causal, and not patient-specific prescribing guidance.</w:t>
       </w:r>
     </w:p>
     <w:sectPr>

</xml_diff>